<commit_message>
Map12,13, AssetBackground, GateAnimaton Fix
</commit_message>
<xml_diff>
--- a/Nyilatkozat MI eszköz felhasználásáról.docx
+++ b/Nyilatkozat MI eszköz felhasználásáról.docx
@@ -84,23 +84,7 @@
           <w:rFonts w:eastAsia="Calibri"/>
           <w:smallCaps/>
         </w:rPr>
-        <w:t xml:space="preserve"> (a beadott .</w:t>
-      </w:r>
-      <w:proofErr w:type="spellStart"/>
-      <w:r>
-        <w:rPr>
-          <w:rFonts w:eastAsia="Calibri"/>
-          <w:smallCaps/>
-        </w:rPr>
-        <w:t>zip</w:t>
-      </w:r>
-      <w:proofErr w:type="spellEnd"/>
-      <w:r>
-        <w:rPr>
-          <w:rFonts w:eastAsia="Calibri"/>
-          <w:smallCaps/>
-        </w:rPr>
-        <w:t xml:space="preserve"> fájlba illesztve)</w:t>
+        <w:t xml:space="preserve"> (a beadott .zip fájlba illesztve)</w:t>
       </w:r>
       <w:r>
         <w:br/>
@@ -175,32 +159,36 @@
         </w:rPr>
         <w:t>Hallgató neve:</w:t>
       </w:r>
-    </w:p>
-    <w:p>
-      <w:pPr>
-        <w:tabs>
-          <w:tab w:val="left" w:pos="142"/>
-          <w:tab w:val="left" w:pos="9498"/>
-        </w:tabs>
-        <w:suppressAutoHyphens/>
-        <w:rPr>
-          <w:rFonts w:eastAsia="Calibri"/>
-          <w:lang w:eastAsia="en-US"/>
-        </w:rPr>
-      </w:pPr>
-      <w:proofErr w:type="spellStart"/>
-      <w:r>
-        <w:rPr>
-          <w:rFonts w:eastAsia="Calibri"/>
-        </w:rPr>
-        <w:t>Neptun</w:t>
-      </w:r>
-      <w:proofErr w:type="spellEnd"/>
-      <w:r>
-        <w:rPr>
-          <w:rFonts w:eastAsia="Calibri"/>
-        </w:rPr>
-        <w:t>-kódja:</w:t>
+      <w:r>
+        <w:rPr>
+          <w:rFonts w:eastAsia="Calibri"/>
+        </w:rPr>
+        <w:t xml:space="preserve"> Pócza Gergő</w:t>
+      </w:r>
+    </w:p>
+    <w:p>
+      <w:pPr>
+        <w:tabs>
+          <w:tab w:val="left" w:pos="142"/>
+          <w:tab w:val="left" w:pos="9498"/>
+        </w:tabs>
+        <w:suppressAutoHyphens/>
+        <w:rPr>
+          <w:rFonts w:eastAsia="Calibri"/>
+          <w:lang w:eastAsia="en-US"/>
+        </w:rPr>
+      </w:pPr>
+      <w:r>
+        <w:rPr>
+          <w:rFonts w:eastAsia="Calibri"/>
+        </w:rPr>
+        <w:t>Neptun-kódja:</w:t>
+      </w:r>
+      <w:r>
+        <w:rPr>
+          <w:rFonts w:eastAsia="Calibri"/>
+        </w:rPr>
+        <w:t xml:space="preserve"> M7K94W</w:t>
       </w:r>
     </w:p>
     <w:p>
@@ -220,6 +208,12 @@
           <w:rFonts w:eastAsia="Calibri"/>
         </w:rPr>
         <w:t>Szak neve:</w:t>
+      </w:r>
+      <w:r>
+        <w:rPr>
+          <w:rFonts w:eastAsia="Calibri"/>
+        </w:rPr>
+        <w:t xml:space="preserve"> programtervező informatikus</w:t>
       </w:r>
     </w:p>
     <w:p>
@@ -285,6 +279,12 @@
         </w:rPr>
         <w:t>Címe:</w:t>
       </w:r>
+      <w:r>
+        <w:rPr>
+          <w:rFonts w:eastAsia="Calibri"/>
+        </w:rPr>
+        <w:t xml:space="preserve"> PuzzlePlatformer</w:t>
+      </w:r>
     </w:p>
     <w:p>
       <w:pPr>
@@ -308,21 +308,7 @@
         <w:rPr>
           <w:rFonts w:eastAsia="Calibri"/>
         </w:rPr>
-        <w:t xml:space="preserve">: </w:t>
-      </w:r>
-      <w:proofErr w:type="spellStart"/>
-      <w:r>
-        <w:rPr>
-          <w:rFonts w:eastAsia="Calibri"/>
-        </w:rPr>
-        <w:t>BSc</w:t>
-      </w:r>
-      <w:proofErr w:type="spellEnd"/>
-      <w:r>
-        <w:rPr>
-          <w:rFonts w:eastAsia="Calibri"/>
-        </w:rPr>
-        <w:t xml:space="preserve">/MSc </w:t>
+        <w:t xml:space="preserve">: BSc/MSc </w:t>
       </w:r>
       <w:r>
         <w:rPr>
@@ -350,6 +336,12 @@
           <w:rFonts w:eastAsia="Calibri"/>
         </w:rPr>
         <w:t>Oktató/témavezető neve:</w:t>
+      </w:r>
+      <w:r>
+        <w:rPr>
+          <w:rFonts w:eastAsia="Calibri"/>
+        </w:rPr>
+        <w:t xml:space="preserve"> Bencsik Gergely</w:t>
       </w:r>
     </w:p>
     <w:p>
@@ -669,25 +661,7 @@
                 <w:i/>
                 <w:iCs/>
               </w:rPr>
-              <w:t xml:space="preserve">(pl. MI kimenet </w:t>
-            </w:r>
-            <w:proofErr w:type="spellStart"/>
-            <w:r>
-              <w:rPr>
-                <w:rFonts w:eastAsia="Calibri"/>
-                <w:i/>
-                <w:iCs/>
-              </w:rPr>
-              <w:t>validálása</w:t>
-            </w:r>
-            <w:proofErr w:type="spellEnd"/>
-            <w:r>
-              <w:rPr>
-                <w:rFonts w:eastAsia="Calibri"/>
-                <w:i/>
-                <w:iCs/>
-              </w:rPr>
-              <w:t>, feladathoz illesztése, átdolgozás, a kritikus és kreatív felhasználás bizonyítékai</w:t>
+              <w:t>(pl. MI kimenet validálása, feladathoz illesztése, átdolgozás, a kritikus és kreatív felhasználás bizonyítékai</w:t>
             </w:r>
             <w:r>
               <w:rPr>
@@ -781,61 +755,7 @@
                 <w:i/>
                 <w:iCs/>
               </w:rPr>
-              <w:t xml:space="preserve">(pl. </w:t>
-            </w:r>
-            <w:proofErr w:type="spellStart"/>
-            <w:r>
-              <w:rPr>
-                <w:rFonts w:eastAsia="Calibri"/>
-                <w:i/>
-                <w:iCs/>
-              </w:rPr>
-              <w:t>ChatGPT</w:t>
-            </w:r>
-            <w:proofErr w:type="spellEnd"/>
-            <w:r>
-              <w:rPr>
-                <w:rFonts w:eastAsia="Calibri"/>
-                <w:i/>
-                <w:iCs/>
-              </w:rPr>
-              <w:t xml:space="preserve"> 3.0, </w:t>
-            </w:r>
-            <w:proofErr w:type="spellStart"/>
-            <w:r>
-              <w:rPr>
-                <w:rFonts w:eastAsia="Calibri"/>
-                <w:i/>
-                <w:iCs/>
-              </w:rPr>
-              <w:t>Copilot</w:t>
-            </w:r>
-            <w:proofErr w:type="spellEnd"/>
-            <w:r>
-              <w:rPr>
-                <w:rFonts w:eastAsia="Calibri"/>
-                <w:i/>
-                <w:iCs/>
-              </w:rPr>
-              <w:t xml:space="preserve">, </w:t>
-            </w:r>
-            <w:proofErr w:type="spellStart"/>
-            <w:r>
-              <w:rPr>
-                <w:rFonts w:eastAsia="Calibri"/>
-                <w:i/>
-                <w:iCs/>
-              </w:rPr>
-              <w:t>Grok</w:t>
-            </w:r>
-            <w:proofErr w:type="spellEnd"/>
-            <w:r>
-              <w:rPr>
-                <w:rFonts w:eastAsia="Calibri"/>
-                <w:i/>
-                <w:iCs/>
-              </w:rPr>
-              <w:t>)</w:t>
+              <w:t>(pl. ChatGPT 3.0, Copilot, Grok)</w:t>
             </w:r>
           </w:p>
         </w:tc>

</xml_diff>

<commit_message>
Some final fix and refactor
</commit_message>
<xml_diff>
--- a/Nyilatkozat MI eszköz felhasználásáról.docx
+++ b/Nyilatkozat MI eszköz felhasználásáról.docx
@@ -548,8 +548,8 @@
       </w:tblPr>
       <w:tblGrid>
         <w:gridCol w:w="1890"/>
-        <w:gridCol w:w="2774"/>
-        <w:gridCol w:w="2482"/>
+        <w:gridCol w:w="3205"/>
+        <w:gridCol w:w="2051"/>
         <w:gridCol w:w="2764"/>
       </w:tblGrid>
       <w:tr>
@@ -620,7 +620,7 @@
         </w:tc>
         <w:tc>
           <w:tcPr>
-            <w:tcW w:w="2774" w:type="dxa"/>
+            <w:tcW w:w="3205" w:type="dxa"/>
             <w:tcBorders>
               <w:top w:val="single" w:sz="6" w:space="0" w:color="auto"/>
               <w:left w:val="single" w:sz="6" w:space="0" w:color="auto"/>
@@ -699,7 +699,7 @@
         </w:tc>
         <w:tc>
           <w:tcPr>
-            <w:tcW w:w="2482" w:type="dxa"/>
+            <w:tcW w:w="2051" w:type="dxa"/>
             <w:tcBorders>
               <w:top w:val="single" w:sz="6" w:space="0" w:color="auto"/>
               <w:left w:val="single" w:sz="6" w:space="0" w:color="auto"/>
@@ -835,11 +835,25 @@
                 <w:lang w:eastAsia="en-US"/>
               </w:rPr>
             </w:pPr>
+            <w:r>
+              <w:rPr>
+                <w:rFonts w:eastAsia="Calibri"/>
+                <w:lang w:eastAsia="en-US"/>
+              </w:rPr>
+              <w:t>Unity f</w:t>
+            </w:r>
+            <w:r>
+              <w:rPr>
+                <w:rFonts w:eastAsia="Calibri"/>
+                <w:lang w:eastAsia="en-US"/>
+              </w:rPr>
+              <w:t>unkció működése</w:t>
+            </w:r>
           </w:p>
         </w:tc>
         <w:tc>
           <w:tcPr>
-            <w:tcW w:w="2774" w:type="dxa"/>
+            <w:tcW w:w="3205" w:type="dxa"/>
             <w:tcBorders>
               <w:top w:val="single" w:sz="6" w:space="0" w:color="auto"/>
               <w:left w:val="single" w:sz="6" w:space="0" w:color="auto"/>
@@ -861,11 +875,67 @@
                 <w:lang w:eastAsia="en-US"/>
               </w:rPr>
             </w:pPr>
+            <w:r>
+              <w:rPr>
+                <w:rFonts w:eastAsia="Calibri"/>
+                <w:lang w:eastAsia="en-US"/>
+              </w:rPr>
+              <w:t xml:space="preserve">Bizonyos unity-s funkciók lehetőségének megkérdezésére, </w:t>
+            </w:r>
+            <w:r>
+              <w:rPr>
+                <w:rFonts w:eastAsia="Calibri"/>
+                <w:lang w:eastAsia="en-US"/>
+              </w:rPr>
+              <w:t xml:space="preserve">pl. </w:t>
+            </w:r>
+            <w:r>
+              <w:rPr>
+                <w:rFonts w:eastAsia="Calibri"/>
+                <w:lang w:eastAsia="en-US"/>
+              </w:rPr>
+              <w:t>ablakfelbontás lekérdezése</w:t>
+            </w:r>
+            <w:r>
+              <w:rPr>
+                <w:rFonts w:eastAsia="Calibri"/>
+                <w:lang w:eastAsia="en-US"/>
+              </w:rPr>
+              <w:t xml:space="preserve"> </w:t>
+            </w:r>
+            <w:r>
+              <w:rPr>
+                <w:rFonts w:eastAsia="Calibri"/>
+                <w:lang w:eastAsia="en-US"/>
+              </w:rPr>
+              <w:t>/</w:t>
+            </w:r>
+            <w:r>
+              <w:rPr>
+                <w:rFonts w:eastAsia="Calibri"/>
+                <w:lang w:eastAsia="en-US"/>
+              </w:rPr>
+              <w:t xml:space="preserve"> </w:t>
+            </w:r>
+            <w:r>
+              <w:rPr>
+                <w:rFonts w:eastAsia="Calibri"/>
+                <w:lang w:eastAsia="en-US"/>
+              </w:rPr>
+              <w:t>kezelés</w:t>
+            </w:r>
+            <w:r>
+              <w:rPr>
+                <w:rFonts w:eastAsia="Calibri"/>
+                <w:lang w:eastAsia="en-US"/>
+              </w:rPr>
+              <w:t>i opciók</w:t>
+            </w:r>
           </w:p>
         </w:tc>
         <w:tc>
           <w:tcPr>
-            <w:tcW w:w="2482" w:type="dxa"/>
+            <w:tcW w:w="2051" w:type="dxa"/>
             <w:tcBorders>
               <w:top w:val="single" w:sz="6" w:space="0" w:color="auto"/>
               <w:left w:val="single" w:sz="6" w:space="0" w:color="auto"/>
@@ -887,6 +957,13 @@
                 <w:lang w:eastAsia="en-US"/>
               </w:rPr>
             </w:pPr>
+            <w:r>
+              <w:rPr>
+                <w:rFonts w:eastAsia="Calibri"/>
+                <w:lang w:eastAsia="en-US"/>
+              </w:rPr>
+              <w:t>Opera AI</w:t>
+            </w:r>
           </w:p>
         </w:tc>
         <w:tc>
@@ -913,6 +990,13 @@
                 <w:lang w:eastAsia="en-US"/>
               </w:rPr>
             </w:pPr>
+            <w:r>
+              <w:rPr>
+                <w:rFonts w:eastAsia="Calibri"/>
+                <w:lang w:eastAsia="en-US"/>
+              </w:rPr>
+              <w:t>Program kód</w:t>
+            </w:r>
           </w:p>
         </w:tc>
       </w:tr>
@@ -944,11 +1028,18 @@
                 <w:lang w:eastAsia="en-US"/>
               </w:rPr>
             </w:pPr>
+            <w:r>
+              <w:rPr>
+                <w:rFonts w:eastAsia="Calibri"/>
+                <w:lang w:eastAsia="en-US"/>
+              </w:rPr>
+              <w:t>Definíció meghatározás</w:t>
+            </w:r>
           </w:p>
         </w:tc>
         <w:tc>
           <w:tcPr>
-            <w:tcW w:w="2774" w:type="dxa"/>
+            <w:tcW w:w="3205" w:type="dxa"/>
             <w:tcBorders>
               <w:top w:val="single" w:sz="6" w:space="0" w:color="auto"/>
               <w:left w:val="single" w:sz="6" w:space="0" w:color="auto"/>
@@ -970,11 +1061,18 @@
                 <w:lang w:eastAsia="en-US"/>
               </w:rPr>
             </w:pPr>
+            <w:r>
+              <w:rPr>
+                <w:rFonts w:eastAsia="Calibri"/>
+                <w:lang w:eastAsia="en-US"/>
+              </w:rPr>
+              <w:t>A használt fogalmak rövid definícióját kértem, majd ez alapján töltöttem ki a táblázatot</w:t>
+            </w:r>
           </w:p>
         </w:tc>
         <w:tc>
           <w:tcPr>
-            <w:tcW w:w="2482" w:type="dxa"/>
+            <w:tcW w:w="2051" w:type="dxa"/>
             <w:tcBorders>
               <w:top w:val="single" w:sz="6" w:space="0" w:color="auto"/>
               <w:left w:val="single" w:sz="6" w:space="0" w:color="auto"/>
@@ -996,6 +1094,13 @@
                 <w:lang w:eastAsia="en-US"/>
               </w:rPr>
             </w:pPr>
+            <w:r>
+              <w:rPr>
+                <w:rFonts w:eastAsia="Calibri"/>
+                <w:lang w:eastAsia="en-US"/>
+              </w:rPr>
+              <w:t>Opera AI</w:t>
+            </w:r>
           </w:p>
         </w:tc>
         <w:tc>
@@ -1022,115 +1127,13 @@
                 <w:lang w:eastAsia="en-US"/>
               </w:rPr>
             </w:pPr>
-          </w:p>
-        </w:tc>
-      </w:tr>
-      <w:tr>
-        <w:trPr>
-          <w:trHeight w:val="333"/>
-        </w:trPr>
-        <w:tc>
-          <w:tcPr>
-            <w:tcW w:w="1890" w:type="dxa"/>
-            <w:tcBorders>
-              <w:top w:val="single" w:sz="6" w:space="0" w:color="auto"/>
-              <w:left w:val="single" w:sz="6" w:space="0" w:color="auto"/>
-              <w:bottom w:val="single" w:sz="6" w:space="0" w:color="auto"/>
-              <w:right w:val="single" w:sz="6" w:space="0" w:color="auto"/>
-            </w:tcBorders>
-          </w:tcPr>
-          <w:p>
-            <w:pPr>
-              <w:tabs>
-                <w:tab w:val="left" w:pos="142"/>
-                <w:tab w:val="left" w:pos="9498"/>
-              </w:tabs>
-              <w:suppressAutoHyphens/>
-              <w:spacing w:line="276" w:lineRule="auto"/>
-              <w:ind w:right="-1"/>
-              <w:rPr>
-                <w:rFonts w:eastAsia="Calibri"/>
-                <w:lang w:eastAsia="en-US"/>
-              </w:rPr>
-            </w:pPr>
-          </w:p>
-        </w:tc>
-        <w:tc>
-          <w:tcPr>
-            <w:tcW w:w="2774" w:type="dxa"/>
-            <w:tcBorders>
-              <w:top w:val="single" w:sz="6" w:space="0" w:color="auto"/>
-              <w:left w:val="single" w:sz="6" w:space="0" w:color="auto"/>
-              <w:bottom w:val="single" w:sz="6" w:space="0" w:color="auto"/>
-              <w:right w:val="single" w:sz="6" w:space="0" w:color="auto"/>
-            </w:tcBorders>
-          </w:tcPr>
-          <w:p>
-            <w:pPr>
-              <w:tabs>
-                <w:tab w:val="left" w:pos="142"/>
-                <w:tab w:val="left" w:pos="9498"/>
-              </w:tabs>
-              <w:suppressAutoHyphens/>
-              <w:spacing w:line="276" w:lineRule="auto"/>
-              <w:ind w:right="-1"/>
-              <w:rPr>
-                <w:rFonts w:eastAsia="Calibri"/>
-                <w:lang w:eastAsia="en-US"/>
-              </w:rPr>
-            </w:pPr>
-          </w:p>
-        </w:tc>
-        <w:tc>
-          <w:tcPr>
-            <w:tcW w:w="2482" w:type="dxa"/>
-            <w:tcBorders>
-              <w:top w:val="single" w:sz="6" w:space="0" w:color="auto"/>
-              <w:left w:val="single" w:sz="6" w:space="0" w:color="auto"/>
-              <w:bottom w:val="single" w:sz="6" w:space="0" w:color="auto"/>
-              <w:right w:val="single" w:sz="6" w:space="0" w:color="auto"/>
-            </w:tcBorders>
-          </w:tcPr>
-          <w:p>
-            <w:pPr>
-              <w:tabs>
-                <w:tab w:val="left" w:pos="142"/>
-                <w:tab w:val="left" w:pos="9498"/>
-              </w:tabs>
-              <w:suppressAutoHyphens/>
-              <w:spacing w:line="276" w:lineRule="auto"/>
-              <w:ind w:right="-1"/>
-              <w:rPr>
-                <w:rFonts w:eastAsia="Calibri"/>
-                <w:lang w:eastAsia="en-US"/>
-              </w:rPr>
-            </w:pPr>
-          </w:p>
-        </w:tc>
-        <w:tc>
-          <w:tcPr>
-            <w:tcW w:w="2764" w:type="dxa"/>
-            <w:tcBorders>
-              <w:top w:val="single" w:sz="6" w:space="0" w:color="auto"/>
-              <w:left w:val="single" w:sz="6" w:space="0" w:color="auto"/>
-              <w:bottom w:val="single" w:sz="6" w:space="0" w:color="auto"/>
-              <w:right w:val="single" w:sz="6" w:space="0" w:color="auto"/>
-            </w:tcBorders>
-          </w:tcPr>
-          <w:p>
-            <w:pPr>
-              <w:tabs>
-                <w:tab w:val="left" w:pos="142"/>
-                <w:tab w:val="left" w:pos="9498"/>
-              </w:tabs>
-              <w:suppressAutoHyphens/>
-              <w:spacing w:line="276" w:lineRule="auto"/>
-              <w:ind w:right="-1"/>
-              <w:rPr>
-                <w:rFonts w:eastAsia="Calibri"/>
-                <w:lang w:eastAsia="en-US"/>
-              </w:rPr>
-            </w:pPr>
+            <w:r>
+              <w:rPr>
+                <w:rFonts w:eastAsia="Calibri"/>
+                <w:lang w:eastAsia="en-US"/>
+              </w:rPr>
+              <w:t>Dokumentáció fogalom definíció táblázat</w:t>
+            </w:r>
           </w:p>
         </w:tc>
       </w:tr>
@@ -1317,7 +1320,16 @@
           <w:noProof/>
           <w:lang w:eastAsia="en-US"/>
         </w:rPr>
-        <w:t xml:space="preserve">a 4/2025. (X. 28.) számú, </w:t>
+        <w:t xml:space="preserve">a </w:t>
+      </w:r>
+      <w:r>
+        <w:rPr>
+          <w:rFonts w:eastAsia="Calibri"/>
+          <w:noProof/>
+          <w:lang w:eastAsia="en-US"/>
+        </w:rPr>
+        <w:lastRenderedPageBreak/>
+        <w:t xml:space="preserve">4/2025. (X. 28.) számú, </w:t>
       </w:r>
       <w:bookmarkStart w:id="0" w:name="_Hlk213336472"/>
       <w:r>
@@ -1433,16 +1445,7 @@
           <w:noProof/>
           <w:lang w:eastAsia="en-US"/>
         </w:rPr>
-        <w:t xml:space="preserve">tartalmát, valamint a </w:t>
-      </w:r>
-      <w:r>
-        <w:rPr>
-          <w:rFonts w:eastAsia="Calibri"/>
-          <w:noProof/>
-          <w:lang w:eastAsia="en-US"/>
-        </w:rPr>
-        <w:lastRenderedPageBreak/>
-        <w:t xml:space="preserve">I/2026 (III. 26.) számú, </w:t>
+        <w:t xml:space="preserve">tartalmát, valamint a I/2026 (III. 26.) számú, </w:t>
       </w:r>
       <w:hyperlink r:id="rId6" w:history="1">
         <w:r>

</xml_diff>